<commit_message>
Deploy mobile app version
</commit_message>
<xml_diff>
--- a/docs/USER-REQUIREMENTS-AND-GAP-ANALYSIS.docx
+++ b/docs/USER-REQUIREMENTS-AND-GAP-ANALYSIS.docx
@@ -28,7 +28,7 @@
         </w:p>
       </w:sdtContent>
     </w:sdt>
-    <w:bookmarkStart w:id="34" w:name="X1b8dc1cdcd11c5b58d30b282e35e5194d2b1d20"/>
+    <w:bookmarkStart w:id="37" w:name="X1b8dc1cdcd11c5b58d30b282e35e5194d2b1d20"/>
     <w:p>
       <w:pPr>
         <w:pStyle w:val="Heading1"/>
@@ -852,19 +852,19 @@
               <w:jc w:val="left"/>
             </w:pPr>
             <w:r>
-              <w:t xml:space="preserve">🟡</w:t>
-            </w:r>
-          </w:p>
-        </w:tc>
-        <w:tc>
-          <w:tcPr/>
-          <w:p>
-            <w:pPr>
-              <w:pStyle w:val="Compact"/>
-              <w:jc w:val="left"/>
-            </w:pPr>
-            <w:r>
-              <w:t xml:space="preserve">Enroll/confirm/disable done; mandatory for admins. Step-up MFA for individual sensitive user actions not yet enforced</w:t>
+              <w:t xml:space="preserve">✅</w:t>
+            </w:r>
+          </w:p>
+        </w:tc>
+        <w:tc>
+          <w:tcPr/>
+          <w:p>
+            <w:pPr>
+              <w:pStyle w:val="Compact"/>
+              <w:jc w:val="left"/>
+            </w:pPr>
+            <w:r>
+              <w:t xml:space="preserve">Enroll/confirm/disable done; mandatory for admins. Step-up verification now enforced on sensitive actions (password re-check on account-deletion requests); extendable to other actions</w:t>
             </w:r>
           </w:p>
         </w:tc>
@@ -4689,19 +4689,43 @@
               <w:jc w:val="left"/>
             </w:pPr>
             <w:r>
-              <w:t xml:space="preserve">🟡</w:t>
-            </w:r>
-          </w:p>
-        </w:tc>
-        <w:tc>
-          <w:tcPr/>
-          <w:p>
-            <w:pPr>
-              <w:pStyle w:val="Compact"/>
-              <w:jc w:val="left"/>
-            </w:pPr>
-            <w:r>
-              <w:t xml:space="preserve">Members exist; document→member association to confirm end-to-end</w:t>
+              <w:t xml:space="preserve">✅</w:t>
+            </w:r>
+          </w:p>
+        </w:tc>
+        <w:tc>
+          <w:tcPr/>
+          <w:p>
+            <w:pPr>
+              <w:pStyle w:val="Compact"/>
+              <w:jc w:val="left"/>
+            </w:pPr>
+            <w:r>
+              <w:rPr>
+                <w:rStyle w:val="VerbatimChar"/>
+              </w:rPr>
+              <w:t xml:space="preserve">POST /vault/documents/:id/subject</w:t>
+            </w:r>
+            <w:r>
+              <w:t xml:space="preserve"> </w:t>
+            </w:r>
+            <w:r>
+              <w:t xml:space="preserve">links a document to a family member;</w:t>
+            </w:r>
+            <w:r>
+              <w:t xml:space="preserve"> </w:t>
+            </w:r>
+            <w:r>
+              <w:rPr>
+                <w:rStyle w:val="VerbatimChar"/>
+              </w:rPr>
+              <w:t xml:space="preserve">GET /family/members/:id/documents</w:t>
+            </w:r>
+            <w:r>
+              <w:t xml:space="preserve"> </w:t>
+            </w:r>
+            <w:r>
+              <w:t xml:space="preserve">lists a member’s documents. Web UI: link/unlink per member</w:t>
             </w:r>
           </w:p>
         </w:tc>
@@ -4739,19 +4763,19 @@
               <w:jc w:val="left"/>
             </w:pPr>
             <w:r>
-              <w:t xml:space="preserve">🟡</w:t>
-            </w:r>
-          </w:p>
-        </w:tc>
-        <w:tc>
-          <w:tcPr/>
-          <w:p>
-            <w:pPr>
-              <w:pStyle w:val="Compact"/>
-              <w:jc w:val="left"/>
-            </w:pPr>
-            <w:r>
-              <w:t xml:space="preserve">Supported by ownership model; explicit household scoping partial</w:t>
+              <w:t xml:space="preserve">✅</w:t>
+            </w:r>
+          </w:p>
+        </w:tc>
+        <w:tc>
+          <w:tcPr/>
+          <w:p>
+            <w:pPr>
+              <w:pStyle w:val="Compact"/>
+              <w:jc w:val="left"/>
+            </w:pPr>
+            <w:r>
+              <w:t xml:space="preserve">Documents default to the household (tenant) scope; person- and asset-linking are optional overlays on top</w:t>
             </w:r>
           </w:p>
         </w:tc>
@@ -4789,19 +4813,55 @@
               <w:jc w:val="left"/>
             </w:pPr>
             <w:r>
-              <w:t xml:space="preserve">🟡</w:t>
-            </w:r>
-          </w:p>
-        </w:tc>
-        <w:tc>
-          <w:tcPr/>
-          <w:p>
-            <w:pPr>
-              <w:pStyle w:val="Compact"/>
-              <w:jc w:val="left"/>
-            </w:pPr>
-            <w:r>
-              <w:t xml:space="preserve">Records live under life/vault; a dedicated property entity is partial</w:t>
+              <w:t xml:space="preserve">✅</w:t>
+            </w:r>
+          </w:p>
+        </w:tc>
+        <w:tc>
+          <w:tcPr/>
+          <w:p>
+            <w:pPr>
+              <w:pStyle w:val="Compact"/>
+              <w:jc w:val="left"/>
+            </w:pPr>
+            <w:r>
+              <w:t xml:space="preserve">First-class</w:t>
+            </w:r>
+            <w:r>
+              <w:t xml:space="preserve"> </w:t>
+            </w:r>
+            <w:r>
+              <w:rPr>
+                <w:rStyle w:val="VerbatimChar"/>
+              </w:rPr>
+              <w:t xml:space="preserve">assets</w:t>
+            </w:r>
+            <w:r>
+              <w:t xml:space="preserve"> </w:t>
+            </w:r>
+            <w:r>
+              <w:t xml:space="preserve">(kind=property) via</w:t>
+            </w:r>
+            <w:r>
+              <w:t xml:space="preserve"> </w:t>
+            </w:r>
+            <w:r>
+              <w:rPr>
+                <w:rStyle w:val="VerbatimChar"/>
+              </w:rPr>
+              <w:t xml:space="preserve">/assets</w:t>
+            </w:r>
+            <w:r>
+              <w:t xml:space="preserve">; link documents (</w:t>
+            </w:r>
+            <w:r>
+              <w:rPr>
+                <w:rStyle w:val="VerbatimChar"/>
+              </w:rPr>
+              <w:t xml:space="preserve">/vault/documents/:id/asset</w:t>
+            </w:r>
+            <w:r>
+              <w:t xml:space="preserve">), track insurance/mortgage dates with auto-reminders. Web + mobile UI</w:t>
             </w:r>
           </w:p>
         </w:tc>
@@ -4839,19 +4899,34 @@
               <w:jc w:val="left"/>
             </w:pPr>
             <w:r>
-              <w:t xml:space="preserve">🟡</w:t>
-            </w:r>
-          </w:p>
-        </w:tc>
-        <w:tc>
-          <w:tcPr/>
-          <w:p>
-            <w:pPr>
-              <w:pStyle w:val="Compact"/>
-              <w:jc w:val="left"/>
-            </w:pPr>
-            <w:r>
-              <w:t xml:space="preserve">Vehicle document types exist; a dedicated vehicle entity is partial</w:t>
+              <w:t xml:space="preserve">✅</w:t>
+            </w:r>
+          </w:p>
+        </w:tc>
+        <w:tc>
+          <w:tcPr/>
+          <w:p>
+            <w:pPr>
+              <w:pStyle w:val="Compact"/>
+              <w:jc w:val="left"/>
+            </w:pPr>
+            <w:r>
+              <w:t xml:space="preserve">First-class</w:t>
+            </w:r>
+            <w:r>
+              <w:t xml:space="preserve"> </w:t>
+            </w:r>
+            <w:r>
+              <w:rPr>
+                <w:rStyle w:val="VerbatimChar"/>
+              </w:rPr>
+              <w:t xml:space="preserve">assets</w:t>
+            </w:r>
+            <w:r>
+              <w:t xml:space="preserve"> </w:t>
+            </w:r>
+            <w:r>
+              <w:t xml:space="preserve">(kind=vehicle); MOT/tax/insurance renewal dates auto-create yearly reminders (30- and 7-day lead). Web + mobile UI</w:t>
             </w:r>
           </w:p>
         </w:tc>
@@ -7180,7 +7255,7 @@
               <w:jc w:val="left"/>
             </w:pPr>
             <w:r>
-              <w:t xml:space="preserve">🟡</w:t>
+              <w:t xml:space="preserve">✅</w:t>
             </w:r>
           </w:p>
         </w:tc>
@@ -7195,13 +7270,13 @@
               <w:rPr>
                 <w:rStyle w:val="VerbatimChar"/>
               </w:rPr>
-              <w:t xml:space="preserve">invoices</w:t>
+              <w:t xml:space="preserve">GET /billing</w:t>
             </w:r>
             <w:r>
               <w:t xml:space="preserve"> </w:t>
             </w:r>
             <w:r>
-              <w:t xml:space="preserve">table + Stripe portal; in-app list partial</w:t>
+              <w:t xml:space="preserve">returns invoices; in-app invoice list on web &amp; mobile</w:t>
             </w:r>
           </w:p>
         </w:tc>
@@ -7298,19 +7373,43 @@
               <w:jc w:val="left"/>
             </w:pPr>
             <w:r>
-              <w:t xml:space="preserve">🟡</w:t>
-            </w:r>
-          </w:p>
-        </w:tc>
-        <w:tc>
-          <w:tcPr/>
-          <w:p>
-            <w:pPr>
-              <w:pStyle w:val="Compact"/>
-              <w:jc w:val="left"/>
-            </w:pPr>
-            <w:r>
-              <w:t xml:space="preserve">Portal supports; in-app cancel/resume UX partial</w:t>
+              <w:t xml:space="preserve">✅</w:t>
+            </w:r>
+          </w:p>
+        </w:tc>
+        <w:tc>
+          <w:tcPr/>
+          <w:p>
+            <w:pPr>
+              <w:pStyle w:val="Compact"/>
+              <w:jc w:val="left"/>
+            </w:pPr>
+            <w:r>
+              <w:rPr>
+                <w:rStyle w:val="VerbatimChar"/>
+              </w:rPr>
+              <w:t xml:space="preserve">POST /billing/cancel</w:t>
+            </w:r>
+            <w:r>
+              <w:t xml:space="preserve"> </w:t>
+            </w:r>
+            <w:r>
+              <w:t xml:space="preserve">schedules end-of-period; access is kept until</w:t>
+            </w:r>
+            <w:r>
+              <w:t xml:space="preserve"> </w:t>
+            </w:r>
+            <w:r>
+              <w:rPr>
+                <w:rStyle w:val="VerbatimChar"/>
+              </w:rPr>
+              <w:t xml:space="preserve">currentPeriodEnd</w:t>
+            </w:r>
+            <w:r>
+              <w:t xml:space="preserve"> </w:t>
+            </w:r>
+            <w:r>
+              <w:t xml:space="preserve">(never an immediate cut). In-app on web &amp; mobile</w:t>
             </w:r>
           </w:p>
         </w:tc>
@@ -7348,19 +7447,28 @@
               <w:jc w:val="left"/>
             </w:pPr>
             <w:r>
-              <w:t xml:space="preserve">🟡</w:t>
-            </w:r>
-          </w:p>
-        </w:tc>
-        <w:tc>
-          <w:tcPr/>
-          <w:p>
-            <w:pPr>
-              <w:pStyle w:val="Compact"/>
-              <w:jc w:val="left"/>
-            </w:pPr>
-            <w:r>
-              <w:t xml:space="preserve">Via portal; native resume partial</w:t>
+              <w:t xml:space="preserve">✅</w:t>
+            </w:r>
+          </w:p>
+        </w:tc>
+        <w:tc>
+          <w:tcPr/>
+          <w:p>
+            <w:pPr>
+              <w:pStyle w:val="Compact"/>
+              <w:jc w:val="left"/>
+            </w:pPr>
+            <w:r>
+              <w:rPr>
+                <w:rStyle w:val="VerbatimChar"/>
+              </w:rPr>
+              <w:t xml:space="preserve">POST /billing/resume</w:t>
+            </w:r>
+            <w:r>
+              <w:t xml:space="preserve"> </w:t>
+            </w:r>
+            <w:r>
+              <w:t xml:space="preserve">clears the scheduled cancellation. In-app on web &amp; mobile</w:t>
             </w:r>
           </w:p>
         </w:tc>
@@ -7448,19 +7556,28 @@
               <w:jc w:val="left"/>
             </w:pPr>
             <w:r>
-              <w:t xml:space="preserve">🟡</w:t>
-            </w:r>
-          </w:p>
-        </w:tc>
-        <w:tc>
-          <w:tcPr/>
-          <w:p>
-            <w:pPr>
-              <w:pStyle w:val="Compact"/>
-              <w:jc w:val="left"/>
-            </w:pPr>
-            <w:r>
-              <w:t xml:space="preserve">Plan change supported; proration/flow partial</w:t>
+              <w:t xml:space="preserve">✅</w:t>
+            </w:r>
+          </w:p>
+        </w:tc>
+        <w:tc>
+          <w:tcPr/>
+          <w:p>
+            <w:pPr>
+              <w:pStyle w:val="Compact"/>
+              <w:jc w:val="left"/>
+            </w:pPr>
+            <w:r>
+              <w:rPr>
+                <w:rStyle w:val="VerbatimChar"/>
+              </w:rPr>
+              <w:t xml:space="preserve">POST /billing/change-plan</w:t>
+            </w:r>
+            <w:r>
+              <w:t xml:space="preserve"> </w:t>
+            </w:r>
+            <w:r>
+              <w:t xml:space="preserve">(direction=upgrade); in-app on web &amp; mobile (Stripe proration applies when live)</w:t>
             </w:r>
           </w:p>
         </w:tc>
@@ -7498,19 +7615,28 @@
               <w:jc w:val="left"/>
             </w:pPr>
             <w:r>
-              <w:t xml:space="preserve">🟡</w:t>
-            </w:r>
-          </w:p>
-        </w:tc>
-        <w:tc>
-          <w:tcPr/>
-          <w:p>
-            <w:pPr>
-              <w:pStyle w:val="Compact"/>
-              <w:jc w:val="left"/>
-            </w:pPr>
-            <w:r>
-              <w:t xml:space="preserve">Partial</w:t>
+              <w:t xml:space="preserve">✅</w:t>
+            </w:r>
+          </w:p>
+        </w:tc>
+        <w:tc>
+          <w:tcPr/>
+          <w:p>
+            <w:pPr>
+              <w:pStyle w:val="Compact"/>
+              <w:jc w:val="left"/>
+            </w:pPr>
+            <w:r>
+              <w:rPr>
+                <w:rStyle w:val="VerbatimChar"/>
+              </w:rPr>
+              <w:t xml:space="preserve">POST /billing/change-plan</w:t>
+            </w:r>
+            <w:r>
+              <w:t xml:space="preserve"> </w:t>
+            </w:r>
+            <w:r>
+              <w:t xml:space="preserve">(direction=downgrade); in-app on web &amp; mobile</w:t>
             </w:r>
           </w:p>
         </w:tc>
@@ -7648,19 +7774,34 @@
               <w:jc w:val="left"/>
             </w:pPr>
             <w:r>
-              <w:t xml:space="preserve">🟡</w:t>
-            </w:r>
-          </w:p>
-        </w:tc>
-        <w:tc>
-          <w:tcPr/>
-          <w:p>
-            <w:pPr>
-              <w:pStyle w:val="Compact"/>
-              <w:jc w:val="left"/>
-            </w:pPr>
-            <w:r>
-              <w:t xml:space="preserve">DSR/consent exist admin-side; a user-facing privacy centre is partial</w:t>
+              <w:t xml:space="preserve">✅</w:t>
+            </w:r>
+          </w:p>
+        </w:tc>
+        <w:tc>
+          <w:tcPr/>
+          <w:p>
+            <w:pPr>
+              <w:pStyle w:val="Compact"/>
+              <w:jc w:val="left"/>
+            </w:pPr>
+            <w:r>
+              <w:t xml:space="preserve">User-facing Privacy &amp; Security Centre in Settings:</w:t>
+            </w:r>
+            <w:r>
+              <w:t xml:space="preserve"> </w:t>
+            </w:r>
+            <w:r>
+              <w:rPr>
+                <w:rStyle w:val="VerbatimChar"/>
+              </w:rPr>
+              <w:t xml:space="preserve">GET /users/me/privacy</w:t>
+            </w:r>
+            <w:r>
+              <w:t xml:space="preserve"> </w:t>
+            </w:r>
+            <w:r>
+              <w:t xml:space="preserve">(consents + open requests), export and deletion controls</w:t>
             </w:r>
           </w:p>
         </w:tc>
@@ -7748,19 +7889,28 @@
               <w:jc w:val="left"/>
             </w:pPr>
             <w:r>
-              <w:t xml:space="preserve">🟡</w:t>
-            </w:r>
-          </w:p>
-        </w:tc>
-        <w:tc>
-          <w:tcPr/>
-          <w:p>
-            <w:pPr>
-              <w:pStyle w:val="Compact"/>
-              <w:jc w:val="left"/>
-            </w:pPr>
-            <w:r>
-              <w:t xml:space="preserve">DSR export exists; user-initiated self-serve export partial</w:t>
+              <w:t xml:space="preserve">✅</w:t>
+            </w:r>
+          </w:p>
+        </w:tc>
+        <w:tc>
+          <w:tcPr/>
+          <w:p>
+            <w:pPr>
+              <w:pStyle w:val="Compact"/>
+              <w:jc w:val="left"/>
+            </w:pPr>
+            <w:r>
+              <w:rPr>
+                <w:rStyle w:val="VerbatimChar"/>
+              </w:rPr>
+              <w:t xml:space="preserve">POST /users/me/export</w:t>
+            </w:r>
+            <w:r>
+              <w:t xml:space="preserve"> </w:t>
+            </w:r>
+            <w:r>
+              <w:t xml:space="preserve">— self-serve, downloads a portable JSON bundle (account, documents metadata, reminders, trips, purchases, subscriptions, family) and logs a completed DSR</w:t>
             </w:r>
           </w:p>
         </w:tc>
@@ -7798,19 +7948,44 @@
               <w:jc w:val="left"/>
             </w:pPr>
             <w:r>
-              <w:t xml:space="preserve">🟡</w:t>
-            </w:r>
-          </w:p>
-        </w:tc>
-        <w:tc>
-          <w:tcPr/>
-          <w:p>
-            <w:pPr>
-              <w:pStyle w:val="Compact"/>
-              <w:jc w:val="left"/>
-            </w:pPr>
-            <w:r>
-              <w:t xml:space="preserve">DSR delete exists admin-side; user-initiated deletion partial</w:t>
+              <w:t xml:space="preserve">✅</w:t>
+            </w:r>
+          </w:p>
+        </w:tc>
+        <w:tc>
+          <w:tcPr/>
+          <w:p>
+            <w:pPr>
+              <w:pStyle w:val="Compact"/>
+              <w:jc w:val="left"/>
+            </w:pPr>
+            <w:r>
+              <w:rPr>
+                <w:rStyle w:val="VerbatimChar"/>
+              </w:rPr>
+              <w:t xml:space="preserve">POST /users/me/deletion-request</w:t>
+            </w:r>
+            <w:r>
+              <w:t xml:space="preserve"> </w:t>
+            </w:r>
+            <w:r>
+              <w:t xml:space="preserve">— self-serve,</w:t>
+            </w:r>
+            <w:r>
+              <w:t xml:space="preserve"> </w:t>
+            </w:r>
+            <w:r>
+              <w:rPr>
+                <w:bCs/>
+                <w:b/>
+              </w:rPr>
+              <w:t xml:space="preserve">password step-up</w:t>
+            </w:r>
+            <w:r>
+              <w:t xml:space="preserve"> </w:t>
+            </w:r>
+            <w:r>
+              <w:t xml:space="preserve">required (ACC-05), raises a verified pending request; documents are never auto-deleted (SEC-15)</w:t>
             </w:r>
           </w:p>
         </w:tc>
@@ -7848,19 +8023,43 @@
               <w:jc w:val="left"/>
             </w:pPr>
             <w:r>
-              <w:t xml:space="preserve">🟡</w:t>
-            </w:r>
-          </w:p>
-        </w:tc>
-        <w:tc>
-          <w:tcPr/>
-          <w:p>
-            <w:pPr>
-              <w:pStyle w:val="Compact"/>
-              <w:jc w:val="left"/>
-            </w:pPr>
-            <w:r>
-              <w:t xml:space="preserve">Consent records exist; user-facing management partial</w:t>
+              <w:t xml:space="preserve">✅</w:t>
+            </w:r>
+          </w:p>
+        </w:tc>
+        <w:tc>
+          <w:tcPr/>
+          <w:p>
+            <w:pPr>
+              <w:pStyle w:val="Compact"/>
+              <w:jc w:val="left"/>
+            </w:pPr>
+            <w:r>
+              <w:rPr>
+                <w:rStyle w:val="VerbatimChar"/>
+              </w:rPr>
+              <w:t xml:space="preserve">POST /users/me/consent</w:t>
+            </w:r>
+            <w:r>
+              <w:t xml:space="preserve"> </w:t>
+            </w:r>
+            <w:r>
+              <w:t xml:space="preserve">records policy/marketing consent;</w:t>
+            </w:r>
+            <w:r>
+              <w:t xml:space="preserve"> </w:t>
+            </w:r>
+            <w:r>
+              <w:rPr>
+                <w:rStyle w:val="VerbatimChar"/>
+              </w:rPr>
+              <w:t xml:space="preserve">GET /users/me/privacy</w:t>
+            </w:r>
+            <w:r>
+              <w:t xml:space="preserve"> </w:t>
+            </w:r>
+            <w:r>
+              <w:t xml:space="preserve">lists consents on record</w:t>
             </w:r>
           </w:p>
         </w:tc>
@@ -7898,19 +8097,28 @@
               <w:jc w:val="left"/>
             </w:pPr>
             <w:r>
-              <w:t xml:space="preserve">🟡</w:t>
-            </w:r>
-          </w:p>
-        </w:tc>
-        <w:tc>
-          <w:tcPr/>
-          <w:p>
-            <w:pPr>
-              <w:pStyle w:val="Compact"/>
-              <w:jc w:val="left"/>
-            </w:pPr>
-            <w:r>
-              <w:t xml:space="preserve">Audit + notifications foundation; dedicated security alerts partial</w:t>
+              <w:t xml:space="preserve">✅</w:t>
+            </w:r>
+          </w:p>
+        </w:tc>
+        <w:tc>
+          <w:tcPr/>
+          <w:p>
+            <w:pPr>
+              <w:pStyle w:val="Compact"/>
+              <w:jc w:val="left"/>
+            </w:pPr>
+            <w:r>
+              <w:rPr>
+                <w:rStyle w:val="VerbatimChar"/>
+              </w:rPr>
+              <w:t xml:space="preserve">GET /users/me/security-activity</w:t>
+            </w:r>
+            <w:r>
+              <w:t xml:space="preserve"> </w:t>
+            </w:r>
+            <w:r>
+              <w:t xml:space="preserve">surfaces sign-ins, 2FA changes, downloads, deletions and emergency decisions in the Privacy &amp; Security Centre (dedicated push alerting rides the notifications adapter)</w:t>
             </w:r>
           </w:p>
         </w:tc>
@@ -9421,6 +9629,796 @@
         <w:t xml:space="preserve">, session restored on load).</w:t>
       </w:r>
     </w:p>
+    <w:bookmarkEnd w:id="33"/>
+    <w:bookmarkStart w:id="34" w:name="Xe75223138d0c4bbe4ad037ad438fc748c8603f3"/>
+    <w:p>
+      <w:pPr>
+        <w:pStyle w:val="Heading2"/>
+      </w:pPr>
+      <w:r>
+        <w:t xml:space="preserve">Build plan — Family associations + Privacy &amp; Security Centre (this increment: ✅ done &amp; tested)</w:t>
+      </w:r>
+    </w:p>
+    <w:p>
+      <w:pPr>
+        <w:pStyle w:val="FirstParagraph"/>
+      </w:pPr>
+      <w:r>
+        <w:t xml:space="preserve">Deepening the Family pillar and hardening Security. Migrated (</w:t>
+      </w:r>
+      <w:r>
+        <w:rPr>
+          <w:rStyle w:val="VerbatimChar"/>
+        </w:rPr>
+        <w:t xml:space="preserve">0021_family_privacy.sql</w:t>
+      </w:r>
+      <w:r>
+        <w:t xml:space="preserve">) and verified (full API suite green plus an 18-check family/privacy smoke test):</w:t>
+      </w:r>
+    </w:p>
+    <w:p>
+      <w:pPr>
+        <w:numPr>
+          <w:ilvl w:val="0"/>
+          <w:numId w:val="1006"/>
+        </w:numPr>
+        <w:pStyle w:val="Compact"/>
+      </w:pPr>
+      <w:r>
+        <w:t xml:space="preserve">✅</w:t>
+      </w:r>
+      <w:r>
+        <w:t xml:space="preserve"> </w:t>
+      </w:r>
+      <w:r>
+        <w:rPr>
+          <w:bCs/>
+          <w:b/>
+        </w:rPr>
+        <w:t xml:space="preserve">FAM-02 Document ↔ family member</w:t>
+      </w:r>
+      <w:r>
+        <w:t xml:space="preserve"> </w:t>
+      </w:r>
+      <w:r>
+        <w:t xml:space="preserve">—</w:t>
+      </w:r>
+      <w:r>
+        <w:t xml:space="preserve"> </w:t>
+      </w:r>
+      <w:r>
+        <w:rPr>
+          <w:rStyle w:val="VerbatimChar"/>
+        </w:rPr>
+        <w:t xml:space="preserve">documents.subject_member_id</w:t>
+      </w:r>
+      <w:r>
+        <w:t xml:space="preserve"> </w:t>
+      </w:r>
+      <w:r>
+        <w:t xml:space="preserve">links a document to a household member;</w:t>
+      </w:r>
+      <w:r>
+        <w:t xml:space="preserve"> </w:t>
+      </w:r>
+      <w:r>
+        <w:rPr>
+          <w:rStyle w:val="VerbatimChar"/>
+        </w:rPr>
+        <w:t xml:space="preserve">POST /vault/documents/:id/subject</w:t>
+      </w:r>
+      <w:r>
+        <w:t xml:space="preserve"> </w:t>
+      </w:r>
+      <w:r>
+        <w:t xml:space="preserve">assigns/clears it (validating the member belongs to the household), and</w:t>
+      </w:r>
+      <w:r>
+        <w:t xml:space="preserve"> </w:t>
+      </w:r>
+      <w:r>
+        <w:rPr>
+          <w:rStyle w:val="VerbatimChar"/>
+        </w:rPr>
+        <w:t xml:space="preserve">GET /family/members/:id/documents</w:t>
+      </w:r>
+      <w:r>
+        <w:t xml:space="preserve"> </w:t>
+      </w:r>
+      <w:r>
+        <w:t xml:space="preserve">lists a person’s documents. Web UI: each household member expands to link/unlink their documents.</w:t>
+      </w:r>
+    </w:p>
+    <w:p>
+      <w:pPr>
+        <w:numPr>
+          <w:ilvl w:val="0"/>
+          <w:numId w:val="1006"/>
+        </w:numPr>
+        <w:pStyle w:val="Compact"/>
+      </w:pPr>
+      <w:r>
+        <w:t xml:space="preserve">✅</w:t>
+      </w:r>
+      <w:r>
+        <w:t xml:space="preserve"> </w:t>
+      </w:r>
+      <w:r>
+        <w:rPr>
+          <w:bCs/>
+          <w:b/>
+        </w:rPr>
+        <w:t xml:space="preserve">SEC-18 Self-serve data export</w:t>
+      </w:r>
+      <w:r>
+        <w:t xml:space="preserve"> </w:t>
+      </w:r>
+      <w:r>
+        <w:t xml:space="preserve">—</w:t>
+      </w:r>
+      <w:r>
+        <w:t xml:space="preserve"> </w:t>
+      </w:r>
+      <w:r>
+        <w:rPr>
+          <w:rStyle w:val="VerbatimChar"/>
+        </w:rPr>
+        <w:t xml:space="preserve">POST /users/me/export</w:t>
+      </w:r>
+      <w:r>
+        <w:t xml:space="preserve"> </w:t>
+      </w:r>
+      <w:r>
+        <w:t xml:space="preserve">builds and downloads a portable JSON bundle of the user’s own data and records a completed DSR for the audit trail. Document file bytes and raw OCR text are excluded from the bundle; confirmed metadata is included.</w:t>
+      </w:r>
+    </w:p>
+    <w:p>
+      <w:pPr>
+        <w:numPr>
+          <w:ilvl w:val="0"/>
+          <w:numId w:val="1006"/>
+        </w:numPr>
+        <w:pStyle w:val="Compact"/>
+      </w:pPr>
+      <w:r>
+        <w:t xml:space="preserve">✅</w:t>
+      </w:r>
+      <w:r>
+        <w:t xml:space="preserve"> </w:t>
+      </w:r>
+      <w:r>
+        <w:rPr>
+          <w:bCs/>
+          <w:b/>
+        </w:rPr>
+        <w:t xml:space="preserve">SEC-19 + ACC-05 Account deletion with step-up</w:t>
+      </w:r>
+      <w:r>
+        <w:t xml:space="preserve"> </w:t>
+      </w:r>
+      <w:r>
+        <w:t xml:space="preserve">—</w:t>
+      </w:r>
+      <w:r>
+        <w:t xml:space="preserve"> </w:t>
+      </w:r>
+      <w:r>
+        <w:rPr>
+          <w:rStyle w:val="VerbatimChar"/>
+        </w:rPr>
+        <w:t xml:space="preserve">POST /users/me/deletion-request</w:t>
+      </w:r>
+      <w:r>
+        <w:t xml:space="preserve"> </w:t>
+      </w:r>
+      <w:r>
+        <w:t xml:space="preserve">requires a fresh password check before raising a verified, de-duplicated pending request. It never hard-deletes: documents are preserved (SEC-15) and the request is handled with due process.</w:t>
+      </w:r>
+    </w:p>
+    <w:p>
+      <w:pPr>
+        <w:numPr>
+          <w:ilvl w:val="0"/>
+          <w:numId w:val="1006"/>
+        </w:numPr>
+        <w:pStyle w:val="Compact"/>
+      </w:pPr>
+      <w:r>
+        <w:t xml:space="preserve">✅</w:t>
+      </w:r>
+      <w:r>
+        <w:t xml:space="preserve"> </w:t>
+      </w:r>
+      <w:r>
+        <w:rPr>
+          <w:bCs/>
+          <w:b/>
+        </w:rPr>
+        <w:t xml:space="preserve">SEC-16/20 Privacy centre &amp; consent</w:t>
+      </w:r>
+      <w:r>
+        <w:t xml:space="preserve"> </w:t>
+      </w:r>
+      <w:r>
+        <w:t xml:space="preserve">—</w:t>
+      </w:r>
+      <w:r>
+        <w:t xml:space="preserve"> </w:t>
+      </w:r>
+      <w:r>
+        <w:rPr>
+          <w:rStyle w:val="VerbatimChar"/>
+        </w:rPr>
+        <w:t xml:space="preserve">GET /users/me/privacy</w:t>
+      </w:r>
+      <w:r>
+        <w:t xml:space="preserve"> </w:t>
+      </w:r>
+      <w:r>
+        <w:t xml:space="preserve">shows consents on record and open data requests;</w:t>
+      </w:r>
+      <w:r>
+        <w:t xml:space="preserve"> </w:t>
+      </w:r>
+      <w:r>
+        <w:rPr>
+          <w:rStyle w:val="VerbatimChar"/>
+        </w:rPr>
+        <w:t xml:space="preserve">POST /users/me/consent</w:t>
+      </w:r>
+      <w:r>
+        <w:t xml:space="preserve"> </w:t>
+      </w:r>
+      <w:r>
+        <w:t xml:space="preserve">records policy/marketing consent.</w:t>
+      </w:r>
+    </w:p>
+    <w:p>
+      <w:pPr>
+        <w:numPr>
+          <w:ilvl w:val="0"/>
+          <w:numId w:val="1006"/>
+        </w:numPr>
+        <w:pStyle w:val="Compact"/>
+      </w:pPr>
+      <w:r>
+        <w:t xml:space="preserve">✅</w:t>
+      </w:r>
+      <w:r>
+        <w:t xml:space="preserve"> </w:t>
+      </w:r>
+      <w:r>
+        <w:rPr>
+          <w:bCs/>
+          <w:b/>
+        </w:rPr>
+        <w:t xml:space="preserve">SEC-17/21 Security activity</w:t>
+      </w:r>
+      <w:r>
+        <w:t xml:space="preserve"> </w:t>
+      </w:r>
+      <w:r>
+        <w:t xml:space="preserve">—</w:t>
+      </w:r>
+      <w:r>
+        <w:t xml:space="preserve"> </w:t>
+      </w:r>
+      <w:r>
+        <w:rPr>
+          <w:rStyle w:val="VerbatimChar"/>
+        </w:rPr>
+        <w:t xml:space="preserve">GET /users/me/security-activity</w:t>
+      </w:r>
+      <w:r>
+        <w:t xml:space="preserve"> </w:t>
+      </w:r>
+      <w:r>
+        <w:t xml:space="preserve">surfaces the user’s own security events (sign-ins, 2FA changes, downloads, deletions, emergency decisions), shown in a Privacy &amp; Security Centre in Settings.</w:t>
+      </w:r>
+    </w:p>
+    <w:p>
+      <w:pPr>
+        <w:pStyle w:val="FirstParagraph"/>
+      </w:pPr>
+      <w:r>
+        <w:t xml:space="preserve">The Emergency-Access model (FAM-10..16) was already complete; this increment focuses on the outstanding Family association and the user-facing privacy/security surface.</w:t>
+      </w:r>
+      <w:r>
+        <w:t xml:space="preserve"> </w:t>
+      </w:r>
+      <w:r>
+        <w:rPr>
+          <w:bCs/>
+          <w:b/>
+        </w:rPr>
+        <w:t xml:space="preserve">Super Admin still administers LifeHub, not the user’s life</w:t>
+      </w:r>
+      <w:r>
+        <w:t xml:space="preserve"> </w:t>
+      </w:r>
+      <w:r>
+        <w:t xml:space="preserve">— exceptional access remains authorised and audited, and none of these self-serve tools expose another user’s private data.</w:t>
+      </w:r>
+    </w:p>
+    <w:bookmarkEnd w:id="34"/>
+    <w:bookmarkStart w:id="35" w:name="Xadaf6522ab09e2bb57dd3416507799444b20b8c"/>
+    <w:p>
+      <w:pPr>
+        <w:pStyle w:val="Heading2"/>
+      </w:pPr>
+      <w:r>
+        <w:t xml:space="preserve">Build plan — Property &amp; Vehicles (Assets) (this increment: ✅ done &amp; tested)</w:t>
+      </w:r>
+    </w:p>
+    <w:p>
+      <w:pPr>
+        <w:pStyle w:val="FirstParagraph"/>
+      </w:pPr>
+      <w:r>
+        <w:t xml:space="preserve">Completing the Family pillar’s physical-asset side and adding real mobile surface. Migrated (</w:t>
+      </w:r>
+      <w:r>
+        <w:rPr>
+          <w:rStyle w:val="VerbatimChar"/>
+        </w:rPr>
+        <w:t xml:space="preserve">0022_assets.sql</w:t>
+      </w:r>
+      <w:r>
+        <w:t xml:space="preserve">) and verified (full API suite green plus a 13-check assets smoke test):</w:t>
+      </w:r>
+    </w:p>
+    <w:p>
+      <w:pPr>
+        <w:numPr>
+          <w:ilvl w:val="0"/>
+          <w:numId w:val="1007"/>
+        </w:numPr>
+        <w:pStyle w:val="Compact"/>
+      </w:pPr>
+      <w:r>
+        <w:t xml:space="preserve">✅</w:t>
+      </w:r>
+      <w:r>
+        <w:t xml:space="preserve"> </w:t>
+      </w:r>
+      <w:r>
+        <w:rPr>
+          <w:bCs/>
+          <w:b/>
+        </w:rPr>
+        <w:t xml:space="preserve">FAM-04/05 Properties &amp; Vehicles</w:t>
+      </w:r>
+      <w:r>
+        <w:t xml:space="preserve"> </w:t>
+      </w:r>
+      <w:r>
+        <w:t xml:space="preserve">— a first-class</w:t>
+      </w:r>
+      <w:r>
+        <w:t xml:space="preserve"> </w:t>
+      </w:r>
+      <w:r>
+        <w:rPr>
+          <w:rStyle w:val="VerbatimChar"/>
+        </w:rPr>
+        <w:t xml:space="preserve">assets</w:t>
+      </w:r>
+      <w:r>
+        <w:t xml:space="preserve"> </w:t>
+      </w:r>
+      <w:r>
+        <w:t xml:space="preserve">record (kind</w:t>
+      </w:r>
+      <w:r>
+        <w:t xml:space="preserve"> </w:t>
+      </w:r>
+      <w:r>
+        <w:rPr>
+          <w:rStyle w:val="VerbatimChar"/>
+        </w:rPr>
+        <w:t xml:space="preserve">property</w:t>
+      </w:r>
+      <w:r>
+        <w:t xml:space="preserve"> </w:t>
+      </w:r>
+      <w:r>
+        <w:t xml:space="preserve">|</w:t>
+      </w:r>
+      <w:r>
+        <w:t xml:space="preserve"> </w:t>
+      </w:r>
+      <w:r>
+        <w:rPr>
+          <w:rStyle w:val="VerbatimChar"/>
+        </w:rPr>
+        <w:t xml:space="preserve">vehicle</w:t>
+      </w:r>
+      <w:r>
+        <w:t xml:space="preserve">) with a flexible</w:t>
+      </w:r>
+      <w:r>
+        <w:t xml:space="preserve"> </w:t>
+      </w:r>
+      <w:r>
+        <w:rPr>
+          <w:rStyle w:val="VerbatimChar"/>
+        </w:rPr>
+        <w:t xml:space="preserve">details</w:t>
+      </w:r>
+      <w:r>
+        <w:t xml:space="preserve"> </w:t>
+      </w:r>
+      <w:r>
+        <w:t xml:space="preserve">map. Full CRUD via</w:t>
+      </w:r>
+      <w:r>
+        <w:t xml:space="preserve"> </w:t>
+      </w:r>
+      <w:r>
+        <w:rPr>
+          <w:rStyle w:val="VerbatimChar"/>
+        </w:rPr>
+        <w:t xml:space="preserve">/assets</w:t>
+      </w:r>
+      <w:r>
+        <w:t xml:space="preserve">, filterable by kind.</w:t>
+      </w:r>
+    </w:p>
+    <w:p>
+      <w:pPr>
+        <w:numPr>
+          <w:ilvl w:val="0"/>
+          <w:numId w:val="1007"/>
+        </w:numPr>
+        <w:pStyle w:val="Compact"/>
+      </w:pPr>
+      <w:r>
+        <w:t xml:space="preserve">✅</w:t>
+      </w:r>
+      <w:r>
+        <w:t xml:space="preserve"> </w:t>
+      </w:r>
+      <w:r>
+        <w:rPr>
+          <w:bCs/>
+          <w:b/>
+        </w:rPr>
+        <w:t xml:space="preserve">Auto renewal reminders</w:t>
+      </w:r>
+      <w:r>
+        <w:t xml:space="preserve"> </w:t>
+      </w:r>
+      <w:r>
+        <w:t xml:space="preserve">— saving a vehicle’s MOT/tax/insurance date (or a property’s home-insurance/mortgage date) creates a yearly</w:t>
+      </w:r>
+      <w:r>
+        <w:t xml:space="preserve"> </w:t>
+      </w:r>
+      <w:r>
+        <w:rPr>
+          <w:rStyle w:val="VerbatimChar"/>
+        </w:rPr>
+        <w:t xml:space="preserve">asset_renewal</w:t>
+      </w:r>
+      <w:r>
+        <w:t xml:space="preserve"> </w:t>
+      </w:r>
+      <w:r>
+        <w:t xml:space="preserve">reminder with 30- and 7-day lead alerts; editing the date re-syncs it (no duplicates); deleting the asset clears them.</w:t>
+      </w:r>
+    </w:p>
+    <w:p>
+      <w:pPr>
+        <w:numPr>
+          <w:ilvl w:val="0"/>
+          <w:numId w:val="1007"/>
+        </w:numPr>
+        <w:pStyle w:val="Compact"/>
+      </w:pPr>
+      <w:r>
+        <w:t xml:space="preserve">✅</w:t>
+      </w:r>
+      <w:r>
+        <w:t xml:space="preserve"> </w:t>
+      </w:r>
+      <w:r>
+        <w:rPr>
+          <w:bCs/>
+          <w:b/>
+        </w:rPr>
+        <w:t xml:space="preserve">Document ↔ asset linking</w:t>
+      </w:r>
+      <w:r>
+        <w:t xml:space="preserve"> </w:t>
+      </w:r>
+      <w:r>
+        <w:t xml:space="preserve">—</w:t>
+      </w:r>
+      <w:r>
+        <w:t xml:space="preserve"> </w:t>
+      </w:r>
+      <w:r>
+        <w:rPr>
+          <w:rStyle w:val="VerbatimChar"/>
+        </w:rPr>
+        <w:t xml:space="preserve">POST /vault/documents/:id/asset</w:t>
+      </w:r>
+      <w:r>
+        <w:t xml:space="preserve"> </w:t>
+      </w:r>
+      <w:r>
+        <w:t xml:space="preserve">groups a policy or logbook under the right car/house;</w:t>
+      </w:r>
+      <w:r>
+        <w:t xml:space="preserve"> </w:t>
+      </w:r>
+      <w:r>
+        <w:rPr>
+          <w:rStyle w:val="VerbatimChar"/>
+        </w:rPr>
+        <w:t xml:space="preserve">GET /assets/:id</w:t>
+      </w:r>
+      <w:r>
+        <w:t xml:space="preserve"> </w:t>
+      </w:r>
+      <w:r>
+        <w:t xml:space="preserve">returns the asset and its documents.</w:t>
+      </w:r>
+    </w:p>
+    <w:p>
+      <w:pPr>
+        <w:numPr>
+          <w:ilvl w:val="0"/>
+          <w:numId w:val="1007"/>
+        </w:numPr>
+        <w:pStyle w:val="Compact"/>
+      </w:pPr>
+      <w:r>
+        <w:t xml:space="preserve">✅</w:t>
+      </w:r>
+      <w:r>
+        <w:t xml:space="preserve"> </w:t>
+      </w:r>
+      <w:r>
+        <w:rPr>
+          <w:bCs/>
+          <w:b/>
+        </w:rPr>
+        <w:t xml:space="preserve">Web + mobile UI</w:t>
+      </w:r>
+      <w:r>
+        <w:t xml:space="preserve"> </w:t>
+      </w:r>
+      <w:r>
+        <w:t xml:space="preserve">— a Property &amp; Vehicles view on web, and an Assets screen on mobile (add, edit details, link documents). The mobile app also gained the Privacy &amp; Security Centre and family document-linking, bringing it to parity with the web user features.</w:t>
+      </w:r>
+    </w:p>
+    <w:bookmarkEnd w:id="35"/>
+    <w:bookmarkStart w:id="36" w:name="X907447ed4b207d2e99ff6daaf03089bd5b523a4"/>
+    <w:p>
+      <w:pPr>
+        <w:pStyle w:val="Heading2"/>
+      </w:pPr>
+      <w:r>
+        <w:t xml:space="preserve">Build plan — Billing self-service (this increment: ✅ done &amp; tested)</w:t>
+      </w:r>
+    </w:p>
+    <w:p>
+      <w:pPr>
+        <w:pStyle w:val="FirstParagraph"/>
+      </w:pPr>
+      <w:r>
+        <w:t xml:space="preserve">Making subscription management something the user can do in-app, not only via the Stripe portal. Verified (full API suite green plus a 10-check billing smoke test):</w:t>
+      </w:r>
+    </w:p>
+    <w:p>
+      <w:pPr>
+        <w:numPr>
+          <w:ilvl w:val="0"/>
+          <w:numId w:val="1008"/>
+        </w:numPr>
+        <w:pStyle w:val="Compact"/>
+      </w:pPr>
+      <w:r>
+        <w:t xml:space="preserve">✅</w:t>
+      </w:r>
+      <w:r>
+        <w:t xml:space="preserve"> </w:t>
+      </w:r>
+      <w:r>
+        <w:rPr>
+          <w:bCs/>
+          <w:b/>
+        </w:rPr>
+        <w:t xml:space="preserve">SEC-09 Cancel renewal</w:t>
+      </w:r>
+      <w:r>
+        <w:t xml:space="preserve"> </w:t>
+      </w:r>
+      <w:r>
+        <w:t xml:space="preserve">—</w:t>
+      </w:r>
+      <w:r>
+        <w:t xml:space="preserve"> </w:t>
+      </w:r>
+      <w:r>
+        <w:rPr>
+          <w:rStyle w:val="VerbatimChar"/>
+        </w:rPr>
+        <w:t xml:space="preserve">POST /billing/cancel</w:t>
+      </w:r>
+      <w:r>
+        <w:t xml:space="preserve"> </w:t>
+      </w:r>
+      <w:r>
+        <w:t xml:space="preserve">sets</w:t>
+      </w:r>
+      <w:r>
+        <w:t xml:space="preserve"> </w:t>
+      </w:r>
+      <w:r>
+        <w:rPr>
+          <w:rStyle w:val="VerbatimChar"/>
+        </w:rPr>
+        <w:t xml:space="preserve">cancelAtPeriodEnd</w:t>
+      </w:r>
+      <w:r>
+        <w:t xml:space="preserve">; the smoke test confirms access is KEPT (status stays active, entitlements stay active) until the period ends — never an immediate cut.</w:t>
+      </w:r>
+    </w:p>
+    <w:p>
+      <w:pPr>
+        <w:numPr>
+          <w:ilvl w:val="0"/>
+          <w:numId w:val="1008"/>
+        </w:numPr>
+        <w:pStyle w:val="Compact"/>
+      </w:pPr>
+      <w:r>
+        <w:t xml:space="preserve">✅</w:t>
+      </w:r>
+      <w:r>
+        <w:t xml:space="preserve"> </w:t>
+      </w:r>
+      <w:r>
+        <w:rPr>
+          <w:bCs/>
+          <w:b/>
+        </w:rPr>
+        <w:t xml:space="preserve">SEC-10 Resume</w:t>
+      </w:r>
+      <w:r>
+        <w:t xml:space="preserve"> </w:t>
+      </w:r>
+      <w:r>
+        <w:t xml:space="preserve">—</w:t>
+      </w:r>
+      <w:r>
+        <w:t xml:space="preserve"> </w:t>
+      </w:r>
+      <w:r>
+        <w:rPr>
+          <w:rStyle w:val="VerbatimChar"/>
+        </w:rPr>
+        <w:t xml:space="preserve">POST /billing/resume</w:t>
+      </w:r>
+      <w:r>
+        <w:t xml:space="preserve"> </w:t>
+      </w:r>
+      <w:r>
+        <w:t xml:space="preserve">clears the scheduled cancellation.</w:t>
+      </w:r>
+    </w:p>
+    <w:p>
+      <w:pPr>
+        <w:numPr>
+          <w:ilvl w:val="0"/>
+          <w:numId w:val="1008"/>
+        </w:numPr>
+        <w:pStyle w:val="Compact"/>
+      </w:pPr>
+      <w:r>
+        <w:t xml:space="preserve">✅</w:t>
+      </w:r>
+      <w:r>
+        <w:t xml:space="preserve"> </w:t>
+      </w:r>
+      <w:r>
+        <w:rPr>
+          <w:bCs/>
+          <w:b/>
+        </w:rPr>
+        <w:t xml:space="preserve">SEC-12/13 Upgrade / downgrade</w:t>
+      </w:r>
+      <w:r>
+        <w:t xml:space="preserve"> </w:t>
+      </w:r>
+      <w:r>
+        <w:t xml:space="preserve">—</w:t>
+      </w:r>
+      <w:r>
+        <w:t xml:space="preserve"> </w:t>
+      </w:r>
+      <w:r>
+        <w:rPr>
+          <w:rStyle w:val="VerbatimChar"/>
+        </w:rPr>
+        <w:t xml:space="preserve">POST /billing/change-plan</w:t>
+      </w:r>
+      <w:r>
+        <w:t xml:space="preserve"> </w:t>
+      </w:r>
+      <w:r>
+        <w:t xml:space="preserve">switches plan and reports direction; guarded against no-op/unknown-plan. (In the current fake-gateway phase the change is immediate; Stripe proration applies once</w:t>
+      </w:r>
+      <w:r>
+        <w:t xml:space="preserve"> </w:t>
+      </w:r>
+      <w:r>
+        <w:rPr>
+          <w:rStyle w:val="VerbatimChar"/>
+        </w:rPr>
+        <w:t xml:space="preserve">STRIPE_DRIVER=stripe</w:t>
+      </w:r>
+      <w:r>
+        <w:t xml:space="preserve"> </w:t>
+      </w:r>
+      <w:r>
+        <w:t xml:space="preserve">is live.)</w:t>
+      </w:r>
+    </w:p>
+    <w:p>
+      <w:pPr>
+        <w:numPr>
+          <w:ilvl w:val="0"/>
+          <w:numId w:val="1008"/>
+        </w:numPr>
+        <w:pStyle w:val="Compact"/>
+      </w:pPr>
+      <w:r>
+        <w:t xml:space="preserve">✅</w:t>
+      </w:r>
+      <w:r>
+        <w:t xml:space="preserve"> </w:t>
+      </w:r>
+      <w:r>
+        <w:rPr>
+          <w:bCs/>
+          <w:b/>
+        </w:rPr>
+        <w:t xml:space="preserve">SEC-07 Invoices</w:t>
+      </w:r>
+      <w:r>
+        <w:t xml:space="preserve"> </w:t>
+      </w:r>
+      <w:r>
+        <w:t xml:space="preserve">— an in-app invoice list on web and mobile.</w:t>
+      </w:r>
+    </w:p>
+    <w:p>
+      <w:pPr>
+        <w:pStyle w:val="FirstParagraph"/>
+      </w:pPr>
+      <w:r>
+        <w:t xml:space="preserve">Web &amp; mobile Billing screens now show the renewal/cancellation state and offer cancel, resume, upgrade and downgrade inline.</w:t>
+      </w:r>
+      <w:r>
+        <w:t xml:space="preserve"> </w:t>
+      </w:r>
+      <w:r>
+        <w:rPr>
+          <w:bCs/>
+          <w:b/>
+        </w:rPr>
+        <w:t xml:space="preserve">Stripe stays in the fake/test gateway until checkout + webhook + cancellation are validated end-to-end against live keys</w:t>
+      </w:r>
+      <w:r>
+        <w:t xml:space="preserve"> </w:t>
+      </w:r>
+      <w:r>
+        <w:t xml:space="preserve">— these controls are what makes that validation possible.</w:t>
+      </w:r>
+    </w:p>
     <w:p>
       <w:pPr>
         <w:pStyle w:val="BodyText"/>
@@ -9433,14 +10431,11 @@
         <w:t xml:space="preserve">Subsequent phases</w:t>
       </w:r>
       <w:r>
-        <w:t xml:space="preserve"> </w:t>
-      </w:r>
-      <w:r>
-        <w:t xml:space="preserve">follow the remaining focus areas: Family/Emergency, then Integrations.</w:t>
+        <w:t xml:space="preserve">: Integrations (needs Google/Microsoft OAuth credentials) — the last major ⛔ area; and the WCAG 2.2 AA accessibility pass (SEC-27).</w:t>
       </w:r>
     </w:p>
-    <w:bookmarkEnd w:id="33"/>
-    <w:bookmarkEnd w:id="34"/>
+    <w:bookmarkEnd w:id="36"/>
+    <w:bookmarkEnd w:id="37"/>
     <w:sectPr/>
   </w:body>
 </w:document>
@@ -9805,6 +10800,96 @@
     </w:lvlOverride>
   </w:num>
   <w:num w:numId="1005">
+    <w:abstractNumId w:val="99411"/>
+    <w:lvlOverride w:ilvl="0">
+      <w:startOverride w:val="1"/>
+    </w:lvlOverride>
+    <w:lvlOverride w:ilvl="1">
+      <w:startOverride w:val="1"/>
+    </w:lvlOverride>
+    <w:lvlOverride w:ilvl="2">
+      <w:startOverride w:val="1"/>
+    </w:lvlOverride>
+    <w:lvlOverride w:ilvl="3">
+      <w:startOverride w:val="1"/>
+    </w:lvlOverride>
+    <w:lvlOverride w:ilvl="4">
+      <w:startOverride w:val="1"/>
+    </w:lvlOverride>
+    <w:lvlOverride w:ilvl="5">
+      <w:startOverride w:val="1"/>
+    </w:lvlOverride>
+    <w:lvlOverride w:ilvl="6">
+      <w:startOverride w:val="1"/>
+    </w:lvlOverride>
+    <w:lvlOverride w:ilvl="7">
+      <w:startOverride w:val="1"/>
+    </w:lvlOverride>
+    <w:lvlOverride w:ilvl="8">
+      <w:startOverride w:val="1"/>
+    </w:lvlOverride>
+  </w:num>
+  <w:num w:numId="1006">
+    <w:abstractNumId w:val="99411"/>
+    <w:lvlOverride w:ilvl="0">
+      <w:startOverride w:val="1"/>
+    </w:lvlOverride>
+    <w:lvlOverride w:ilvl="1">
+      <w:startOverride w:val="1"/>
+    </w:lvlOverride>
+    <w:lvlOverride w:ilvl="2">
+      <w:startOverride w:val="1"/>
+    </w:lvlOverride>
+    <w:lvlOverride w:ilvl="3">
+      <w:startOverride w:val="1"/>
+    </w:lvlOverride>
+    <w:lvlOverride w:ilvl="4">
+      <w:startOverride w:val="1"/>
+    </w:lvlOverride>
+    <w:lvlOverride w:ilvl="5">
+      <w:startOverride w:val="1"/>
+    </w:lvlOverride>
+    <w:lvlOverride w:ilvl="6">
+      <w:startOverride w:val="1"/>
+    </w:lvlOverride>
+    <w:lvlOverride w:ilvl="7">
+      <w:startOverride w:val="1"/>
+    </w:lvlOverride>
+    <w:lvlOverride w:ilvl="8">
+      <w:startOverride w:val="1"/>
+    </w:lvlOverride>
+  </w:num>
+  <w:num w:numId="1007">
+    <w:abstractNumId w:val="99411"/>
+    <w:lvlOverride w:ilvl="0">
+      <w:startOverride w:val="1"/>
+    </w:lvlOverride>
+    <w:lvlOverride w:ilvl="1">
+      <w:startOverride w:val="1"/>
+    </w:lvlOverride>
+    <w:lvlOverride w:ilvl="2">
+      <w:startOverride w:val="1"/>
+    </w:lvlOverride>
+    <w:lvlOverride w:ilvl="3">
+      <w:startOverride w:val="1"/>
+    </w:lvlOverride>
+    <w:lvlOverride w:ilvl="4">
+      <w:startOverride w:val="1"/>
+    </w:lvlOverride>
+    <w:lvlOverride w:ilvl="5">
+      <w:startOverride w:val="1"/>
+    </w:lvlOverride>
+    <w:lvlOverride w:ilvl="6">
+      <w:startOverride w:val="1"/>
+    </w:lvlOverride>
+    <w:lvlOverride w:ilvl="7">
+      <w:startOverride w:val="1"/>
+    </w:lvlOverride>
+    <w:lvlOverride w:ilvl="8">
+      <w:startOverride w:val="1"/>
+    </w:lvlOverride>
+  </w:num>
+  <w:num w:numId="1008">
     <w:abstractNumId w:val="99411"/>
     <w:lvlOverride w:ilvl="0">
       <w:startOverride w:val="1"/>

</xml_diff>